<commit_message>
Submit HW04 - Angelo Kelly
</commit_message>
<xml_diff>
--- a/Week3/Project/MatrixOperationsDesignDoc.docx
+++ b/Week3/Project/MatrixOperationsDesignDoc.docx
@@ -1615,13 +1615,7 @@
               <w:rPr>
                 <w:rFonts w:ascii="Times New Roman" w:hAnsi="Times New Roman" w:cs="Times New Roman"/>
               </w:rPr>
-              <w:t>Second</w:t>
-            </w:r>
-            <w:r>
-              <w:rPr>
-                <w:rFonts w:ascii="Times New Roman" w:hAnsi="Times New Roman" w:cs="Times New Roman"/>
-              </w:rPr>
-              <w:t xml:space="preserve"> matrix to be chosen as parameter for the </w:t>
+              <w:t xml:space="preserve">Second matrix to be chosen as parameter for the </w:t>
             </w:r>
             <w:proofErr w:type="spellStart"/>
             <w:r>
@@ -1778,25 +1772,7 @@
               <w:rPr>
                 <w:rFonts w:ascii="Times New Roman" w:hAnsi="Times New Roman" w:cs="Times New Roman"/>
               </w:rPr>
-              <w:t>Number</w:t>
-            </w:r>
-            <w:r>
-              <w:rPr>
-                <w:rFonts w:ascii="Times New Roman" w:hAnsi="Times New Roman" w:cs="Times New Roman"/>
-              </w:rPr>
-              <w:t xml:space="preserve"> of </w:t>
-            </w:r>
-            <w:r>
-              <w:rPr>
-                <w:rFonts w:ascii="Times New Roman" w:hAnsi="Times New Roman" w:cs="Times New Roman"/>
-              </w:rPr>
-              <w:t>columns</w:t>
-            </w:r>
-            <w:r>
-              <w:rPr>
-                <w:rFonts w:ascii="Times New Roman" w:hAnsi="Times New Roman" w:cs="Times New Roman"/>
-              </w:rPr>
-              <w:t xml:space="preserve"> of </w:t>
+              <w:t xml:space="preserve">Number of columns of </w:t>
             </w:r>
             <w:proofErr w:type="spellStart"/>
             <w:r>
@@ -1974,13 +1950,7 @@
               <w:rPr>
                 <w:rFonts w:ascii="Times New Roman" w:hAnsi="Times New Roman" w:cs="Times New Roman"/>
               </w:rPr>
-              <w:t>cols</w:t>
-            </w:r>
-            <w:r>
-              <w:rPr>
-                <w:rFonts w:ascii="Times New Roman" w:hAnsi="Times New Roman" w:cs="Times New Roman"/>
-              </w:rPr>
-              <w:t>_a</w:t>
+              <w:t>cols_a</w:t>
             </w:r>
             <w:proofErr w:type="spellEnd"/>
             <w:r>
@@ -2047,13 +2017,7 @@
               <w:rPr>
                 <w:rFonts w:ascii="Times New Roman" w:hAnsi="Times New Roman" w:cs="Times New Roman"/>
               </w:rPr>
-              <w:t>int</w:t>
-            </w:r>
-            <w:r>
-              <w:rPr>
-                <w:rFonts w:ascii="Times New Roman" w:hAnsi="Times New Roman" w:cs="Times New Roman"/>
-              </w:rPr>
-              <w:t xml:space="preserve"> array</w:t>
+              <w:t>int array</w:t>
             </w:r>
           </w:p>
         </w:tc>
@@ -2131,13 +2095,7 @@
               <w:rPr>
                 <w:rFonts w:ascii="Times New Roman" w:hAnsi="Times New Roman" w:cs="Times New Roman"/>
               </w:rPr>
-              <w:t>int</w:t>
-            </w:r>
-            <w:r>
-              <w:rPr>
-                <w:rFonts w:ascii="Times New Roman" w:hAnsi="Times New Roman" w:cs="Times New Roman"/>
-              </w:rPr>
-              <w:t xml:space="preserve"> array</w:t>
+              <w:t>int array</w:t>
             </w:r>
           </w:p>
         </w:tc>
@@ -2202,13 +2160,7 @@
               <w:rPr>
                 <w:rFonts w:ascii="Times New Roman" w:hAnsi="Times New Roman" w:cs="Times New Roman"/>
               </w:rPr>
-              <w:t>int</w:t>
-            </w:r>
-            <w:r>
-              <w:rPr>
-                <w:rFonts w:ascii="Times New Roman" w:hAnsi="Times New Roman" w:cs="Times New Roman"/>
-              </w:rPr>
-              <w:t xml:space="preserve"> array</w:t>
+              <w:t>int array</w:t>
             </w:r>
           </w:p>
         </w:tc>
@@ -2389,19 +2341,7 @@
               <w:rPr>
                 <w:rFonts w:ascii="Times New Roman" w:hAnsi="Times New Roman" w:cs="Times New Roman"/>
               </w:rPr>
-              <w:t xml:space="preserve">Provided variable to know the number of </w:t>
-            </w:r>
-            <w:r>
-              <w:rPr>
-                <w:rFonts w:ascii="Times New Roman" w:hAnsi="Times New Roman" w:cs="Times New Roman"/>
-              </w:rPr>
-              <w:t>columns</w:t>
-            </w:r>
-            <w:r>
-              <w:rPr>
-                <w:rFonts w:ascii="Times New Roman" w:hAnsi="Times New Roman" w:cs="Times New Roman"/>
-              </w:rPr>
-              <w:t xml:space="preserve"> in the first testing matrix.</w:t>
+              <w:t>Provided variable to know the number of columns in the first testing matrix.</w:t>
             </w:r>
           </w:p>
         </w:tc>
@@ -2695,8 +2635,58 @@
           <w:b/>
           <w:bCs/>
         </w:rPr>
-        <w:t>Print2DArray</w:t>
-      </w:r>
+        <w:t>Print2DArray()</w:t>
+      </w:r>
+      <w:r>
+        <w:rPr>
+          <w:rFonts w:ascii="Times New Roman" w:hAnsi="Times New Roman" w:cs="Times New Roman"/>
+        </w:rPr>
+        <w:br/>
+      </w:r>
+      <w:r>
+        <w:rPr>
+          <w:rFonts w:ascii="Times New Roman" w:hAnsi="Times New Roman" w:cs="Times New Roman"/>
+          <w:b/>
+          <w:bCs/>
+        </w:rPr>
+        <w:t>Purpose:</w:t>
+      </w:r>
+      <w:r>
+        <w:rPr>
+          <w:rFonts w:ascii="Times New Roman" w:hAnsi="Times New Roman" w:cs="Times New Roman"/>
+        </w:rPr>
+        <w:t xml:space="preserve"> Prints the contents of a matrix using square brackets for each row and vertical bars between columns.</w:t>
+      </w:r>
+      <w:r>
+        <w:rPr>
+          <w:rFonts w:ascii="Times New Roman" w:hAnsi="Times New Roman" w:cs="Times New Roman"/>
+        </w:rPr>
+        <w:br/>
+      </w:r>
+      <w:r>
+        <w:rPr>
+          <w:rFonts w:ascii="Times New Roman" w:hAnsi="Times New Roman" w:cs="Times New Roman"/>
+        </w:rPr>
+        <w:br/>
+      </w:r>
+      <w:r>
+        <w:rPr>
+          <w:rFonts w:ascii="Times New Roman" w:hAnsi="Times New Roman" w:cs="Times New Roman"/>
+          <w:b/>
+          <w:bCs/>
+        </w:rPr>
+        <w:t xml:space="preserve">void </w:t>
+      </w:r>
+      <w:proofErr w:type="spellStart"/>
+      <w:r>
+        <w:rPr>
+          <w:rFonts w:ascii="Times New Roman" w:hAnsi="Times New Roman" w:cs="Times New Roman"/>
+          <w:b/>
+          <w:bCs/>
+        </w:rPr>
+        <w:t>MatrixAddition</w:t>
+      </w:r>
+      <w:proofErr w:type="spellEnd"/>
       <w:r>
         <w:rPr>
           <w:rFonts w:ascii="Times New Roman" w:hAnsi="Times New Roman" w:cs="Times New Roman"/>
@@ -2723,7 +2713,7 @@
         <w:rPr>
           <w:rFonts w:ascii="Times New Roman" w:hAnsi="Times New Roman" w:cs="Times New Roman"/>
         </w:rPr>
-        <w:t xml:space="preserve"> Prints the contents of a matrix using square brackets for each row and vertical bars between columns.</w:t>
+        <w:t xml:space="preserve"> Adds two matrices together and prints the resulting matrix.</w:t>
       </w:r>
       <w:r>
         <w:rPr>
@@ -2752,7 +2742,7 @@
           <w:b/>
           <w:bCs/>
         </w:rPr>
-        <w:t>MatrixAddition</w:t>
+        <w:t>TransposeMatrix</w:t>
       </w:r>
       <w:proofErr w:type="spellEnd"/>
       <w:r>
@@ -2781,7 +2771,13 @@
         <w:rPr>
           <w:rFonts w:ascii="Times New Roman" w:hAnsi="Times New Roman" w:cs="Times New Roman"/>
         </w:rPr>
-        <w:t xml:space="preserve"> Adds two matrices together and prints the resulting matrix.</w:t>
+        <w:t xml:space="preserve"> Prints the transpose of the matrix</w:t>
+      </w:r>
+      <w:r>
+        <w:rPr>
+          <w:rFonts w:ascii="Times New Roman" w:hAnsi="Times New Roman" w:cs="Times New Roman"/>
+        </w:rPr>
+        <w:t>, which just switch the position of rows and columns during the loop.</w:t>
       </w:r>
       <w:r>
         <w:rPr>
@@ -2803,6 +2799,54 @@
         </w:rPr>
         <w:t xml:space="preserve">void </w:t>
       </w:r>
+      <w:r>
+        <w:rPr>
+          <w:rFonts w:ascii="Times New Roman" w:hAnsi="Times New Roman" w:cs="Times New Roman"/>
+          <w:b/>
+          <w:bCs/>
+        </w:rPr>
+        <w:t>Determinant()</w:t>
+      </w:r>
+      <w:r>
+        <w:rPr>
+          <w:rFonts w:ascii="Times New Roman" w:hAnsi="Times New Roman" w:cs="Times New Roman"/>
+        </w:rPr>
+        <w:br/>
+      </w:r>
+      <w:r>
+        <w:rPr>
+          <w:rFonts w:ascii="Times New Roman" w:hAnsi="Times New Roman" w:cs="Times New Roman"/>
+          <w:b/>
+          <w:bCs/>
+        </w:rPr>
+        <w:t>Purpose:</w:t>
+      </w:r>
+      <w:r>
+        <w:rPr>
+          <w:rFonts w:ascii="Times New Roman" w:hAnsi="Times New Roman" w:cs="Times New Roman"/>
+        </w:rPr>
+        <w:t xml:space="preserve"> Calculates and prints the determinant of a 2x2 or 3x3 matrix.</w:t>
+      </w:r>
+      <w:r>
+        <w:rPr>
+          <w:rFonts w:ascii="Times New Roman" w:hAnsi="Times New Roman" w:cs="Times New Roman"/>
+        </w:rPr>
+        <w:br/>
+      </w:r>
+      <w:r>
+        <w:rPr>
+          <w:rFonts w:ascii="Times New Roman" w:hAnsi="Times New Roman" w:cs="Times New Roman"/>
+        </w:rPr>
+        <w:br/>
+      </w:r>
+      <w:r>
+        <w:rPr>
+          <w:rFonts w:ascii="Times New Roman" w:hAnsi="Times New Roman" w:cs="Times New Roman"/>
+          <w:b/>
+          <w:bCs/>
+        </w:rPr>
+        <w:t xml:space="preserve">void </w:t>
+      </w:r>
       <w:proofErr w:type="spellStart"/>
       <w:r>
         <w:rPr>
@@ -2810,7 +2854,7 @@
           <w:b/>
           <w:bCs/>
         </w:rPr>
-        <w:t>TransposeMatrix</w:t>
+        <w:t>SearchValue</w:t>
       </w:r>
       <w:proofErr w:type="spellEnd"/>
       <w:r>
@@ -2839,133 +2883,7 @@
         <w:rPr>
           <w:rFonts w:ascii="Times New Roman" w:hAnsi="Times New Roman" w:cs="Times New Roman"/>
         </w:rPr>
-        <w:t xml:space="preserve"> Prints the transpose of the matrix</w:t>
-      </w:r>
-      <w:r>
-        <w:rPr>
-          <w:rFonts w:ascii="Times New Roman" w:hAnsi="Times New Roman" w:cs="Times New Roman"/>
-        </w:rPr>
-        <w:t>, which just switch the position of rows and columns during the loop.</w:t>
-      </w:r>
-      <w:r>
-        <w:rPr>
-          <w:rFonts w:ascii="Times New Roman" w:hAnsi="Times New Roman" w:cs="Times New Roman"/>
-        </w:rPr>
-        <w:br/>
-      </w:r>
-      <w:r>
-        <w:rPr>
-          <w:rFonts w:ascii="Times New Roman" w:hAnsi="Times New Roman" w:cs="Times New Roman"/>
-        </w:rPr>
-        <w:br/>
-      </w:r>
-      <w:r>
-        <w:rPr>
-          <w:rFonts w:ascii="Times New Roman" w:hAnsi="Times New Roman" w:cs="Times New Roman"/>
-          <w:b/>
-          <w:bCs/>
-        </w:rPr>
-        <w:t xml:space="preserve">void </w:t>
-      </w:r>
-      <w:r>
-        <w:rPr>
-          <w:rFonts w:ascii="Times New Roman" w:hAnsi="Times New Roman" w:cs="Times New Roman"/>
-          <w:b/>
-          <w:bCs/>
-        </w:rPr>
-        <w:t>Determinant</w:t>
-      </w:r>
-      <w:r>
-        <w:rPr>
-          <w:rFonts w:ascii="Times New Roman" w:hAnsi="Times New Roman" w:cs="Times New Roman"/>
-          <w:b/>
-          <w:bCs/>
-        </w:rPr>
-        <w:t>()</w:t>
-      </w:r>
-      <w:r>
-        <w:rPr>
-          <w:rFonts w:ascii="Times New Roman" w:hAnsi="Times New Roman" w:cs="Times New Roman"/>
-        </w:rPr>
-        <w:br/>
-      </w:r>
-      <w:r>
-        <w:rPr>
-          <w:rFonts w:ascii="Times New Roman" w:hAnsi="Times New Roman" w:cs="Times New Roman"/>
-          <w:b/>
-          <w:bCs/>
-        </w:rPr>
-        <w:t>Purpose:</w:t>
-      </w:r>
-      <w:r>
-        <w:rPr>
-          <w:rFonts w:ascii="Times New Roman" w:hAnsi="Times New Roman" w:cs="Times New Roman"/>
-        </w:rPr>
-        <w:t xml:space="preserve"> Calculates and prints the determinant of a 2x2 or 3x3 matrix.</w:t>
-      </w:r>
-      <w:r>
-        <w:rPr>
-          <w:rFonts w:ascii="Times New Roman" w:hAnsi="Times New Roman" w:cs="Times New Roman"/>
-        </w:rPr>
-        <w:br/>
-      </w:r>
-      <w:r>
-        <w:rPr>
-          <w:rFonts w:ascii="Times New Roman" w:hAnsi="Times New Roman" w:cs="Times New Roman"/>
-        </w:rPr>
-        <w:br/>
-      </w:r>
-      <w:r>
-        <w:rPr>
-          <w:rFonts w:ascii="Times New Roman" w:hAnsi="Times New Roman" w:cs="Times New Roman"/>
-          <w:b/>
-          <w:bCs/>
-        </w:rPr>
-        <w:t xml:space="preserve">void </w:t>
-      </w:r>
-      <w:proofErr w:type="spellStart"/>
-      <w:r>
-        <w:rPr>
-          <w:rFonts w:ascii="Times New Roman" w:hAnsi="Times New Roman" w:cs="Times New Roman"/>
-          <w:b/>
-          <w:bCs/>
-        </w:rPr>
-        <w:t>SearchValue</w:t>
-      </w:r>
-      <w:proofErr w:type="spellEnd"/>
-      <w:r>
-        <w:rPr>
-          <w:rFonts w:ascii="Times New Roman" w:hAnsi="Times New Roman" w:cs="Times New Roman"/>
-          <w:b/>
-          <w:bCs/>
-        </w:rPr>
-        <w:t>()</w:t>
-      </w:r>
-      <w:r>
-        <w:rPr>
-          <w:rFonts w:ascii="Times New Roman" w:hAnsi="Times New Roman" w:cs="Times New Roman"/>
-        </w:rPr>
-        <w:br/>
-      </w:r>
-      <w:r>
-        <w:rPr>
-          <w:rFonts w:ascii="Times New Roman" w:hAnsi="Times New Roman" w:cs="Times New Roman"/>
-          <w:b/>
-          <w:bCs/>
-        </w:rPr>
-        <w:t>Purpose:</w:t>
-      </w:r>
-      <w:r>
-        <w:rPr>
-          <w:rFonts w:ascii="Times New Roman" w:hAnsi="Times New Roman" w:cs="Times New Roman"/>
-        </w:rPr>
-        <w:t xml:space="preserve"> Searches through the matrix for a target value and prints the index where the value is found.</w:t>
-      </w:r>
-      <w:r>
-        <w:rPr>
-          <w:rFonts w:ascii="Times New Roman" w:hAnsi="Times New Roman" w:cs="Times New Roman"/>
-        </w:rPr>
-        <w:t xml:space="preserve"> </w:t>
+        <w:t xml:space="preserve"> Searches through the matrix for a target value and prints the index where the value is found. </w:t>
       </w:r>
       <w:r>
         <w:rPr>
@@ -3948,6 +3866,11 @@
       </w:pPr>
     </w:p>
     <w:p>
+      <w:pPr>
+        <w:rPr>
+          <w:rFonts w:ascii="Times New Roman" w:hAnsi="Times New Roman" w:cs="Times New Roman"/>
+        </w:rPr>
+      </w:pPr>
       <w:r>
         <w:rPr>
           <w:rFonts w:ascii="Times New Roman" w:hAnsi="Times New Roman" w:cs="Times New Roman"/>
@@ -3967,6 +3890,7 @@
       </w:r>
       <w:r>
         <w:rPr>
+          <w:rFonts w:ascii="Times New Roman" w:hAnsi="Times New Roman" w:cs="Times New Roman"/>
           <w:b/>
           <w:bCs/>
         </w:rPr>
@@ -3974,263 +3898,446 @@
       </w:r>
       <w:r>
         <w:rPr>
+          <w:rFonts w:ascii="Times New Roman" w:hAnsi="Times New Roman" w:cs="Times New Roman"/>
           <w:b/>
           <w:bCs/>
         </w:rPr>
         <w:t xml:space="preserve">: </w:t>
       </w:r>
       <w:r>
+        <w:rPr>
+          <w:rFonts w:ascii="Times New Roman" w:hAnsi="Times New Roman" w:cs="Times New Roman"/>
+        </w:rPr>
         <w:t xml:space="preserve">A 3x3 matrix passed into </w:t>
       </w:r>
       <w:r>
+        <w:rPr>
+          <w:rFonts w:ascii="Times New Roman" w:hAnsi="Times New Roman" w:cs="Times New Roman"/>
+        </w:rPr>
         <w:t xml:space="preserve">void </w:t>
       </w:r>
       <w:r>
+        <w:rPr>
+          <w:rFonts w:ascii="Times New Roman" w:hAnsi="Times New Roman" w:cs="Times New Roman"/>
+        </w:rPr>
         <w:t>Print2DArray</w:t>
       </w:r>
       <w:r>
+        <w:rPr>
+          <w:rFonts w:ascii="Times New Roman" w:hAnsi="Times New Roman" w:cs="Times New Roman"/>
+        </w:rPr>
         <w:t>()</w:t>
       </w:r>
       <w:r>
-        <w:br/>
-      </w:r>
-      <w:r>
-        <w:br/>
-      </w:r>
-      <w:r>
-        <w:rPr>
+        <w:rPr>
+          <w:rFonts w:ascii="Times New Roman" w:hAnsi="Times New Roman" w:cs="Times New Roman"/>
+        </w:rPr>
+        <w:br/>
+      </w:r>
+      <w:r>
+        <w:rPr>
+          <w:rFonts w:ascii="Times New Roman" w:hAnsi="Times New Roman" w:cs="Times New Roman"/>
+        </w:rPr>
+        <w:br/>
+      </w:r>
+      <w:r>
+        <w:rPr>
+          <w:rFonts w:ascii="Times New Roman" w:hAnsi="Times New Roman" w:cs="Times New Roman"/>
           <w:b/>
           <w:bCs/>
         </w:rPr>
         <w:t>Expected Result:</w:t>
       </w:r>
       <w:r>
+        <w:rPr>
+          <w:rFonts w:ascii="Times New Roman" w:hAnsi="Times New Roman" w:cs="Times New Roman"/>
+        </w:rPr>
         <w:t xml:space="preserve"> The matrix prints with each row inside square brackets and columns separated by vertical bars.</w:t>
       </w:r>
       <w:r>
-        <w:br/>
-      </w:r>
-      <w:r>
-        <w:br/>
-      </w:r>
-      <w:r>
-        <w:rPr>
+        <w:rPr>
+          <w:rFonts w:ascii="Times New Roman" w:hAnsi="Times New Roman" w:cs="Times New Roman"/>
+        </w:rPr>
+        <w:br/>
+      </w:r>
+      <w:r>
+        <w:rPr>
+          <w:rFonts w:ascii="Times New Roman" w:hAnsi="Times New Roman" w:cs="Times New Roman"/>
+        </w:rPr>
+        <w:br/>
+      </w:r>
+      <w:r>
+        <w:rPr>
+          <w:rFonts w:ascii="Times New Roman" w:hAnsi="Times New Roman" w:cs="Times New Roman"/>
           <w:b/>
           <w:bCs/>
         </w:rPr>
         <w:t>Case 2:</w:t>
       </w:r>
       <w:r>
+        <w:rPr>
+          <w:rFonts w:ascii="Times New Roman" w:hAnsi="Times New Roman" w:cs="Times New Roman"/>
+        </w:rPr>
         <w:t xml:space="preserve"> Two valid 3x3 matrices passed into</w:t>
       </w:r>
       <w:r>
+        <w:rPr>
+          <w:rFonts w:ascii="Times New Roman" w:hAnsi="Times New Roman" w:cs="Times New Roman"/>
+        </w:rPr>
         <w:t xml:space="preserve"> void </w:t>
       </w:r>
       <w:proofErr w:type="spellStart"/>
       <w:r>
+        <w:rPr>
+          <w:rFonts w:ascii="Times New Roman" w:hAnsi="Times New Roman" w:cs="Times New Roman"/>
+        </w:rPr>
         <w:t>MatrixAddition</w:t>
       </w:r>
       <w:proofErr w:type="spellEnd"/>
       <w:r>
+        <w:rPr>
+          <w:rFonts w:ascii="Times New Roman" w:hAnsi="Times New Roman" w:cs="Times New Roman"/>
+        </w:rPr>
         <w:t xml:space="preserve"> ()</w:t>
       </w:r>
       <w:r>
-        <w:br/>
-      </w:r>
-      <w:r>
-        <w:br/>
-      </w:r>
-      <w:r>
-        <w:rPr>
+        <w:rPr>
+          <w:rFonts w:ascii="Times New Roman" w:hAnsi="Times New Roman" w:cs="Times New Roman"/>
+        </w:rPr>
+        <w:br/>
+      </w:r>
+      <w:r>
+        <w:rPr>
+          <w:rFonts w:ascii="Times New Roman" w:hAnsi="Times New Roman" w:cs="Times New Roman"/>
+        </w:rPr>
+        <w:br/>
+      </w:r>
+      <w:r>
+        <w:rPr>
+          <w:rFonts w:ascii="Times New Roman" w:hAnsi="Times New Roman" w:cs="Times New Roman"/>
           <w:b/>
           <w:bCs/>
         </w:rPr>
         <w:t>Expected Result:</w:t>
       </w:r>
       <w:r>
+        <w:rPr>
+          <w:rFonts w:ascii="Times New Roman" w:hAnsi="Times New Roman" w:cs="Times New Roman"/>
+        </w:rPr>
         <w:t xml:space="preserve"> The function prints a 3x3 result matrix where each value is the sum of the matching values from both input matrices.</w:t>
       </w:r>
       <w:r>
-        <w:br/>
-      </w:r>
-      <w:r>
-        <w:br/>
-      </w:r>
-      <w:r>
-        <w:rPr>
+        <w:rPr>
+          <w:rFonts w:ascii="Times New Roman" w:hAnsi="Times New Roman" w:cs="Times New Roman"/>
+        </w:rPr>
+        <w:br/>
+      </w:r>
+      <w:r>
+        <w:rPr>
+          <w:rFonts w:ascii="Times New Roman" w:hAnsi="Times New Roman" w:cs="Times New Roman"/>
+        </w:rPr>
+        <w:br/>
+      </w:r>
+      <w:r>
+        <w:rPr>
+          <w:rFonts w:ascii="Times New Roman" w:hAnsi="Times New Roman" w:cs="Times New Roman"/>
           <w:b/>
           <w:bCs/>
         </w:rPr>
         <w:t>Case 3:</w:t>
       </w:r>
       <w:r>
+        <w:rPr>
+          <w:rFonts w:ascii="Times New Roman" w:hAnsi="Times New Roman" w:cs="Times New Roman"/>
+        </w:rPr>
         <w:t xml:space="preserve"> A 3x3 matrix passed into </w:t>
       </w:r>
       <w:r>
+        <w:rPr>
+          <w:rFonts w:ascii="Times New Roman" w:hAnsi="Times New Roman" w:cs="Times New Roman"/>
+        </w:rPr>
         <w:t xml:space="preserve">void </w:t>
       </w:r>
       <w:proofErr w:type="spellStart"/>
       <w:r>
+        <w:rPr>
+          <w:rFonts w:ascii="Times New Roman" w:hAnsi="Times New Roman" w:cs="Times New Roman"/>
+        </w:rPr>
         <w:t>TransposeMatrix</w:t>
       </w:r>
       <w:proofErr w:type="spellEnd"/>
       <w:r>
+        <w:rPr>
+          <w:rFonts w:ascii="Times New Roman" w:hAnsi="Times New Roman" w:cs="Times New Roman"/>
+        </w:rPr>
         <w:t xml:space="preserve"> ()</w:t>
       </w:r>
       <w:r>
-        <w:br/>
-      </w:r>
-      <w:r>
-        <w:br/>
-      </w:r>
-      <w:r>
-        <w:rPr>
+        <w:rPr>
+          <w:rFonts w:ascii="Times New Roman" w:hAnsi="Times New Roman" w:cs="Times New Roman"/>
+        </w:rPr>
+        <w:br/>
+      </w:r>
+      <w:r>
+        <w:rPr>
+          <w:rFonts w:ascii="Times New Roman" w:hAnsi="Times New Roman" w:cs="Times New Roman"/>
+        </w:rPr>
+        <w:br/>
+      </w:r>
+      <w:r>
+        <w:rPr>
+          <w:rFonts w:ascii="Times New Roman" w:hAnsi="Times New Roman" w:cs="Times New Roman"/>
           <w:b/>
           <w:bCs/>
         </w:rPr>
         <w:t>Expected Result:</w:t>
       </w:r>
       <w:r>
+        <w:rPr>
+          <w:rFonts w:ascii="Times New Roman" w:hAnsi="Times New Roman" w:cs="Times New Roman"/>
+        </w:rPr>
         <w:t xml:space="preserve"> The function prints a matrix where the original rows and columns are switched.</w:t>
       </w:r>
       <w:r>
-        <w:br/>
-      </w:r>
-      <w:r>
-        <w:br/>
-      </w:r>
-      <w:r>
-        <w:rPr>
+        <w:rPr>
+          <w:rFonts w:ascii="Times New Roman" w:hAnsi="Times New Roman" w:cs="Times New Roman"/>
+        </w:rPr>
+        <w:br/>
+      </w:r>
+      <w:r>
+        <w:rPr>
+          <w:rFonts w:ascii="Times New Roman" w:hAnsi="Times New Roman" w:cs="Times New Roman"/>
+        </w:rPr>
+        <w:br/>
+      </w:r>
+      <w:r>
+        <w:rPr>
+          <w:rFonts w:ascii="Times New Roman" w:hAnsi="Times New Roman" w:cs="Times New Roman"/>
           <w:b/>
           <w:bCs/>
         </w:rPr>
         <w:t>Case 4:</w:t>
       </w:r>
       <w:r>
+        <w:rPr>
+          <w:rFonts w:ascii="Times New Roman" w:hAnsi="Times New Roman" w:cs="Times New Roman"/>
+        </w:rPr>
         <w:t xml:space="preserve"> A </w:t>
       </w:r>
       <w:r>
+        <w:rPr>
+          <w:rFonts w:ascii="Times New Roman" w:hAnsi="Times New Roman" w:cs="Times New Roman"/>
+        </w:rPr>
         <w:t>2</w:t>
       </w:r>
       <w:r>
+        <w:rPr>
+          <w:rFonts w:ascii="Times New Roman" w:hAnsi="Times New Roman" w:cs="Times New Roman"/>
+        </w:rPr>
         <w:t xml:space="preserve">x3 matrix passed into </w:t>
       </w:r>
       <w:r>
+        <w:rPr>
+          <w:rFonts w:ascii="Times New Roman" w:hAnsi="Times New Roman" w:cs="Times New Roman"/>
+        </w:rPr>
         <w:t xml:space="preserve">void </w:t>
       </w:r>
       <w:r>
+        <w:rPr>
+          <w:rFonts w:ascii="Times New Roman" w:hAnsi="Times New Roman" w:cs="Times New Roman"/>
+        </w:rPr>
         <w:t>Determinant</w:t>
       </w:r>
       <w:r>
+        <w:rPr>
+          <w:rFonts w:ascii="Times New Roman" w:hAnsi="Times New Roman" w:cs="Times New Roman"/>
+        </w:rPr>
         <w:t xml:space="preserve"> ()</w:t>
       </w:r>
       <w:r>
-        <w:br/>
-      </w:r>
-      <w:r>
-        <w:br/>
-      </w:r>
-      <w:r>
-        <w:rPr>
+        <w:rPr>
+          <w:rFonts w:ascii="Times New Roman" w:hAnsi="Times New Roman" w:cs="Times New Roman"/>
+        </w:rPr>
+        <w:br/>
+      </w:r>
+      <w:r>
+        <w:rPr>
+          <w:rFonts w:ascii="Times New Roman" w:hAnsi="Times New Roman" w:cs="Times New Roman"/>
+        </w:rPr>
+        <w:br/>
+      </w:r>
+      <w:r>
+        <w:rPr>
+          <w:rFonts w:ascii="Times New Roman" w:hAnsi="Times New Roman" w:cs="Times New Roman"/>
           <w:b/>
           <w:bCs/>
         </w:rPr>
         <w:t xml:space="preserve">Expected Result: </w:t>
       </w:r>
       <w:r>
+        <w:rPr>
+          <w:rFonts w:ascii="Times New Roman" w:hAnsi="Times New Roman" w:cs="Times New Roman"/>
+        </w:rPr>
         <w:t>The function prints th</w:t>
       </w:r>
       <w:r>
+        <w:rPr>
+          <w:rFonts w:ascii="Times New Roman" w:hAnsi="Times New Roman" w:cs="Times New Roman"/>
+        </w:rPr>
         <w:t>at the determinant cannot be found since this operation can only be performed in square matrices.</w:t>
       </w:r>
       <w:r>
-        <w:br/>
-      </w:r>
-      <w:r>
-        <w:br/>
-      </w:r>
-      <w:r>
-        <w:rPr>
+        <w:rPr>
+          <w:rFonts w:ascii="Times New Roman" w:hAnsi="Times New Roman" w:cs="Times New Roman"/>
+        </w:rPr>
+        <w:br/>
+      </w:r>
+      <w:r>
+        <w:rPr>
+          <w:rFonts w:ascii="Times New Roman" w:hAnsi="Times New Roman" w:cs="Times New Roman"/>
+        </w:rPr>
+        <w:br/>
+      </w:r>
+      <w:r>
+        <w:rPr>
+          <w:rFonts w:ascii="Times New Roman" w:hAnsi="Times New Roman" w:cs="Times New Roman"/>
           <w:b/>
           <w:bCs/>
         </w:rPr>
         <w:t>Case 5:</w:t>
       </w:r>
       <w:r>
+        <w:rPr>
+          <w:rFonts w:ascii="Times New Roman" w:hAnsi="Times New Roman" w:cs="Times New Roman"/>
+        </w:rPr>
         <w:t xml:space="preserve"> A matrix and a target value passed into </w:t>
       </w:r>
       <w:r>
+        <w:rPr>
+          <w:rFonts w:ascii="Times New Roman" w:hAnsi="Times New Roman" w:cs="Times New Roman"/>
+        </w:rPr>
         <w:t xml:space="preserve">void </w:t>
       </w:r>
       <w:proofErr w:type="spellStart"/>
       <w:r>
+        <w:rPr>
+          <w:rFonts w:ascii="Times New Roman" w:hAnsi="Times New Roman" w:cs="Times New Roman"/>
+        </w:rPr>
         <w:t>SearchValue</w:t>
       </w:r>
       <w:proofErr w:type="spellEnd"/>
       <w:r>
+        <w:rPr>
+          <w:rFonts w:ascii="Times New Roman" w:hAnsi="Times New Roman" w:cs="Times New Roman"/>
+        </w:rPr>
         <w:t xml:space="preserve"> ()</w:t>
       </w:r>
       <w:r>
-        <w:br/>
-      </w:r>
-      <w:r>
-        <w:br/>
-      </w:r>
-      <w:r>
-        <w:rPr>
+        <w:rPr>
+          <w:rFonts w:ascii="Times New Roman" w:hAnsi="Times New Roman" w:cs="Times New Roman"/>
+        </w:rPr>
+        <w:br/>
+      </w:r>
+      <w:r>
+        <w:rPr>
+          <w:rFonts w:ascii="Times New Roman" w:hAnsi="Times New Roman" w:cs="Times New Roman"/>
+        </w:rPr>
+        <w:br/>
+      </w:r>
+      <w:r>
+        <w:rPr>
+          <w:rFonts w:ascii="Times New Roman" w:hAnsi="Times New Roman" w:cs="Times New Roman"/>
           <w:b/>
           <w:bCs/>
         </w:rPr>
         <w:t>Expected Result:</w:t>
       </w:r>
       <w:r>
+        <w:rPr>
+          <w:rFonts w:ascii="Times New Roman" w:hAnsi="Times New Roman" w:cs="Times New Roman"/>
+        </w:rPr>
         <w:t xml:space="preserve"> The function prints the index of the target if found, or prints that the target was not found.</w:t>
       </w:r>
       <w:r>
-        <w:br/>
-      </w:r>
-      <w:r>
-        <w:br/>
-      </w:r>
-      <w:r>
-        <w:rPr>
+        <w:rPr>
+          <w:rFonts w:ascii="Times New Roman" w:hAnsi="Times New Roman" w:cs="Times New Roman"/>
+        </w:rPr>
+        <w:br/>
+      </w:r>
+      <w:r>
+        <w:rPr>
+          <w:rFonts w:ascii="Times New Roman" w:hAnsi="Times New Roman" w:cs="Times New Roman"/>
+        </w:rPr>
+        <w:br/>
+      </w:r>
+      <w:r>
+        <w:rPr>
+          <w:rFonts w:ascii="Times New Roman" w:hAnsi="Times New Roman" w:cs="Times New Roman"/>
           <w:b/>
           <w:bCs/>
         </w:rPr>
         <w:t>Case 6:</w:t>
       </w:r>
       <w:r>
+        <w:rPr>
+          <w:rFonts w:ascii="Times New Roman" w:hAnsi="Times New Roman" w:cs="Times New Roman"/>
+        </w:rPr>
         <w:t xml:space="preserve"> Two valid matrices passed into </w:t>
       </w:r>
       <w:r>
+        <w:rPr>
+          <w:rFonts w:ascii="Times New Roman" w:hAnsi="Times New Roman" w:cs="Times New Roman"/>
+        </w:rPr>
         <w:t xml:space="preserve">void </w:t>
       </w:r>
       <w:proofErr w:type="spellStart"/>
       <w:r>
+        <w:rPr>
+          <w:rFonts w:ascii="Times New Roman" w:hAnsi="Times New Roman" w:cs="Times New Roman"/>
+        </w:rPr>
         <w:t>MatrixMultiplication</w:t>
       </w:r>
       <w:proofErr w:type="spellEnd"/>
       <w:r>
+        <w:rPr>
+          <w:rFonts w:ascii="Times New Roman" w:hAnsi="Times New Roman" w:cs="Times New Roman"/>
+        </w:rPr>
         <w:t>()</w:t>
       </w:r>
       <w:r>
-        <w:br/>
-      </w:r>
-      <w:r>
-        <w:br/>
-      </w:r>
-      <w:r>
-        <w:rPr>
+        <w:rPr>
+          <w:rFonts w:ascii="Times New Roman" w:hAnsi="Times New Roman" w:cs="Times New Roman"/>
+        </w:rPr>
+        <w:br/>
+      </w:r>
+      <w:r>
+        <w:rPr>
+          <w:rFonts w:ascii="Times New Roman" w:hAnsi="Times New Roman" w:cs="Times New Roman"/>
+        </w:rPr>
+        <w:br/>
+      </w:r>
+      <w:r>
+        <w:rPr>
+          <w:rFonts w:ascii="Times New Roman" w:hAnsi="Times New Roman" w:cs="Times New Roman"/>
           <w:b/>
           <w:bCs/>
         </w:rPr>
         <w:t>Expected Result:</w:t>
       </w:r>
       <w:r>
+        <w:rPr>
+          <w:rFonts w:ascii="Times New Roman" w:hAnsi="Times New Roman" w:cs="Times New Roman"/>
+        </w:rPr>
         <w:t xml:space="preserve"> The function prints the matrix multiplication result.</w:t>
       </w:r>
     </w:p>
-    <w:p/>
+    <w:p>
+      <w:pPr>
+        <w:rPr>
+          <w:rFonts w:ascii="Times New Roman" w:hAnsi="Times New Roman" w:cs="Times New Roman"/>
+        </w:rPr>
+      </w:pPr>
+    </w:p>
     <w:sectPr>
       <w:headerReference w:type="default" r:id="rId7"/>
       <w:pgSz w:w="12240" w:h="15840"/>
@@ -5040,6 +5147,7 @@
   <w:style w:type="character" w:default="1" w:styleId="Fuentedeprrafopredeter">
     <w:name w:val="Default Paragraph Font"/>
     <w:uiPriority w:val="1"/>
+    <w:semiHidden/>
     <w:unhideWhenUsed/>
   </w:style>
   <w:style w:type="table" w:default="1" w:styleId="Tablanormal">

</xml_diff>